<commit_message>
Publish dual-core firmware-first case study v2.2
</commit_message>
<xml_diff>
--- a/01-dual-core-firmware/docs/SCD2_DualCore_Firmware_Host_FRD.docx
+++ b/01-dual-core-firmware/docs/SCD2_DualCore_Firmware_Host_FRD.docx
@@ -62,7 +62,7 @@
               </w:rPr>
               <w:t>Customer-facing technical report</w:t>
               <w:br/>
-              <w:t>Revision 2.0 • 3 August 2026</w:t>
+              <w:t>Revision 2.2 • 3 August 2026</w:t>
             </w:r>
           </w:p>
         </w:tc>
@@ -407,7 +407,7 @@
       <w:r>
         <w:drawing>
           <wp:inline xmlns:a="http://schemas.openxmlformats.org/drawingml/2006/main" xmlns:pic="http://schemas.openxmlformats.org/drawingml/2006/picture">
-            <wp:extent cx="6035040" cy="3520440"/>
+            <wp:extent cx="6035040" cy="3560674"/>
             <wp:docPr id="1" name="Picture 1"/>
             <wp:cNvGraphicFramePr>
               <a:graphicFrameLocks noChangeAspect="1"/>
@@ -428,7 +428,7 @@
                   <pic:spPr>
                     <a:xfrm>
                       <a:off x="0" y="0"/>
-                      <a:ext cx="6035040" cy="3520440"/>
+                      <a:ext cx="6035040" cy="3560674"/>
                     </a:xfrm>
                     <a:prstGeom prst="rect"/>
                   </pic:spPr>
@@ -528,7 +528,7 @@
       <w:r>
         <w:drawing>
           <wp:inline xmlns:a="http://schemas.openxmlformats.org/drawingml/2006/main" xmlns:pic="http://schemas.openxmlformats.org/drawingml/2006/picture">
-            <wp:extent cx="6035040" cy="3017520"/>
+            <wp:extent cx="6035040" cy="3168396"/>
             <wp:docPr id="2" name="Picture 2"/>
             <wp:cNvGraphicFramePr>
               <a:graphicFrameLocks noChangeAspect="1"/>
@@ -549,7 +549,7 @@
                   <pic:spPr>
                     <a:xfrm>
                       <a:off x="0" y="0"/>
-                      <a:ext cx="6035040" cy="3017520"/>
+                      <a:ext cx="6035040" cy="3168396"/>
                     </a:xfrm>
                     <a:prstGeom prst="rect"/>
                   </pic:spPr>
@@ -1919,7 +1919,7 @@
       <w:r>
         <w:drawing>
           <wp:inline xmlns:a="http://schemas.openxmlformats.org/drawingml/2006/main" xmlns:pic="http://schemas.openxmlformats.org/drawingml/2006/picture">
-            <wp:extent cx="5943600" cy="3343275"/>
+            <wp:extent cx="5943600" cy="3235960"/>
             <wp:docPr id="3" name="Picture 3"/>
             <wp:cNvGraphicFramePr>
               <a:graphicFrameLocks noChangeAspect="1"/>
@@ -1940,7 +1940,7 @@
                   <pic:spPr>
                     <a:xfrm>
                       <a:off x="0" y="0"/>
-                      <a:ext cx="5943600" cy="3343275"/>
+                      <a:ext cx="5943600" cy="3235960"/>
                     </a:xfrm>
                     <a:prstGeom prst="rect"/>
                   </pic:spPr>
@@ -6699,7 +6699,7 @@
                 <w:color w:val="222222"/>
                 <w:sz w:val="16"/>
               </w:rPr>
-              <w:t>2.0</w:t>
+              <w:t>2.2</w:t>
             </w:r>
           </w:p>
         </w:tc>
@@ -6757,7 +6757,7 @@
                 <w:color w:val="222222"/>
                 <w:sz w:val="16"/>
               </w:rPr>
-              <w:t>Firmware-first rewrite adding verified STM32H747/OpenAMP architecture, memory map, IPC rates, timing constants, coherency controls, and public source excerpts.</w:t>
+              <w:t>Final layout-refined firmware-first release with verified STM32H747/OpenAMP architecture, memory map, IPC rates, timing constants, coherency controls, and public source excerpts.</w:t>
             </w:r>
           </w:p>
         </w:tc>
@@ -6928,7 +6928,7 @@
               <w:color w:val="555555"/>
               <w:sz w:val="16"/>
             </w:rPr>
-            <w:t>ENGINEERING REPORT  |  REV 2.0</w:t>
+            <w:t>ENGINEERING REPORT  |  REV 2.2</w:t>
           </w:r>
         </w:p>
       </w:tc>

</xml_diff>